<commit_message>
add command line invocation to advanced debugger
</commit_message>
<xml_diff>
--- a/docs/assets/ANNA_Guide.docx
+++ b/docs/assets/ANNA_Guide.docx
@@ -22501,9 +22501,51 @@
         </w:rPr>
         <w:t>displays that update as the program executes.</w:t>
       </w:r>
-    </w:p>
-    <w:p>
-      <w:pPr>
+      <w:r>
+        <w:rPr>
+          <w:lang w:bidi="ar-SA"/>
+        </w:rPr>
+        <w:t xml:space="preserve">  To assemble and invoke the advanced debugger:</w:t>
+      </w:r>
+    </w:p>
+    <w:p>
+      <w:pPr>
+        <w:rPr>
+          <w:lang w:bidi="ar-SA"/>
+        </w:rPr>
+      </w:pPr>
+    </w:p>
+    <w:p>
+      <w:pPr>
+        <w:pStyle w:val="Code"/>
+        <w:rPr>
+          <w:lang w:bidi="ar-SA"/>
+        </w:rPr>
+      </w:pPr>
+      <w:proofErr w:type="spellStart"/>
+      <w:r>
+        <w:rPr>
+          <w:lang w:bidi="ar-SA"/>
+        </w:rPr>
+        <w:t>annasim</w:t>
+      </w:r>
+      <w:proofErr w:type="spellEnd"/>
+      <w:r>
+        <w:rPr>
+          <w:lang w:bidi="ar-SA"/>
+        </w:rPr>
+        <w:t xml:space="preserve"> your_filename.asm -</w:t>
+      </w:r>
+      <w:r>
+        <w:rPr>
+          <w:lang w:bidi="ar-SA"/>
+        </w:rPr>
+        <w:t>a</w:t>
+      </w:r>
+    </w:p>
+    <w:p>
+      <w:pPr>
+        <w:ind w:left="0" w:firstLine="0"/>
         <w:rPr>
           <w:lang w:bidi="ar-SA"/>
         </w:rPr>
@@ -23193,7 +23235,14 @@
         <w:rPr>
           <w:lang w:bidi="ar-SA"/>
         </w:rPr>
-        <w:t xml:space="preserve">In ANNA, every instruction takes one cycle to execute.  By default, the simulator will automatically terminate any program that exceeds 10,000 cycles.  You may override this behavior by specifying a different maximum cycle count with the </w:t>
+        <w:t xml:space="preserve">In ANNA, every instruction takes one cycle to execute.  By default, the simulator will automatically terminate any program that exceeds 10,000 cycles.  You may override this </w:t>
+      </w:r>
+      <w:r>
+        <w:rPr>
+          <w:lang w:bidi="ar-SA"/>
+        </w:rPr>
+        <w:lastRenderedPageBreak/>
+        <w:t xml:space="preserve">behavior by specifying a different maximum cycle count with the </w:t>
       </w:r>
       <w:r>
         <w:rPr>
@@ -28765,6 +28814,7 @@
   <w:style w:type="character" w:default="1" w:styleId="DefaultParagraphFont">
     <w:name w:val="Default Paragraph Font"/>
     <w:uiPriority w:val="1"/>
+    <w:semiHidden/>
     <w:unhideWhenUsed/>
   </w:style>
   <w:style w:type="table" w:default="1" w:styleId="TableNormal">

</xml_diff>